<commit_message>
Finished ffsnditmstoassoc merge function..
</commit_message>
<xml_diff>
--- a/project/documents/formaldocuments/ApplicationDataSheet_Update.docx
+++ b/project/documents/formaldocuments/ApplicationDataSheet_Update.docx
@@ -841,7 +841,7 @@
               <w:rPr>
                 <w:rFonts w:cstheme="minorHAnsi"/>
               </w:rPr>
-              <w:t>request@slwip.com</w:t>
+              <w:t>&lt;&lt;custNoEmail&gt;&gt;</w:t>
             </w:r>
           </w:p>
         </w:tc>
@@ -1029,7 +1029,19 @@
               <w:rPr>
                 <w:rFonts w:cstheme="minorHAnsi"/>
               </w:rPr>
-              <w:t>&lt;&lt;title&gt;&gt;</w:t>
+              <w:t>&lt;&lt;</w:t>
+            </w:r>
+            <w:r>
+              <w:rPr>
+                <w:rFonts w:cstheme="minorHAnsi"/>
+              </w:rPr>
+              <w:t>app</w:t>
+            </w:r>
+            <w:r>
+              <w:rPr>
+                <w:rFonts w:cstheme="minorHAnsi"/>
+              </w:rPr>
+              <w:t>title&gt;&gt;</w:t>
             </w:r>
           </w:p>
         </w:tc>
@@ -1128,7 +1140,19 @@
               <w:rPr>
                 <w:rFonts w:eastAsia="Arial" w:cstheme="minorHAnsi"/>
               </w:rPr>
-              <w:t>&lt;&lt;matterNo&gt;&gt;</w:t>
+              <w:t>&lt;&lt;</w:t>
+            </w:r>
+            <w:r>
+              <w:rPr>
+                <w:rFonts w:eastAsia="Arial" w:cstheme="minorHAnsi"/>
+              </w:rPr>
+              <w:t>app</w:t>
+            </w:r>
+            <w:r>
+              <w:rPr>
+                <w:rFonts w:eastAsia="Arial" w:cstheme="minorHAnsi"/>
+              </w:rPr>
+              <w:t>matterNo&gt;&gt;</w:t>
             </w:r>
           </w:p>
         </w:tc>
@@ -1271,7 +1295,21 @@
                 <w:rFonts w:eastAsia="Arial" w:cstheme="minorHAnsi"/>
                 <w:bCs/>
               </w:rPr>
-              <w:t>Non-Provisional</w:t>
+              <w:t>&lt;&lt;app</w:t>
+            </w:r>
+            <w:r>
+              <w:rPr>
+                <w:rFonts w:eastAsia="Arial" w:cstheme="minorHAnsi"/>
+                <w:bCs/>
+              </w:rPr>
+              <w:t>p</w:t>
+            </w:r>
+            <w:r>
+              <w:rPr>
+                <w:rFonts w:eastAsia="Arial" w:cstheme="minorHAnsi"/>
+                <w:bCs/>
+              </w:rPr>
+              <w:t>rov&gt;&gt;</w:t>
             </w:r>
           </w:p>
         </w:tc>
@@ -1338,7 +1376,19 @@
               <w:rPr>
                 <w:rFonts w:cs="Arial"/>
               </w:rPr>
-              <w:t>&lt;&lt;matterType&gt;&gt;</w:t>
+              <w:t>&lt;&lt;</w:t>
+            </w:r>
+            <w:r>
+              <w:rPr>
+                <w:rFonts w:cs="Arial"/>
+              </w:rPr>
+              <w:t>app</w:t>
+            </w:r>
+            <w:r>
+              <w:rPr>
+                <w:rFonts w:cs="Arial"/>
+              </w:rPr>
+              <w:t>matterType&gt;&gt;</w:t>
             </w:r>
           </w:p>
         </w:tc>
@@ -3068,7 +3118,6 @@
               </w:rPr>
               <w:t xml:space="preserve"> </w:t>
             </w:r>
-            <w:proofErr w:type="gramStart"/>
             <w:r>
               <w:rPr>
                 <w:rFonts w:eastAsia="Arial" w:cstheme="minorHAnsi"/>
@@ -3108,18 +3157,7 @@
                 <w:sz w:val="20"/>
                 <w:szCs w:val="20"/>
               </w:rPr>
-              <w:t>either</w:t>
-            </w:r>
-            <w:proofErr w:type="gramEnd"/>
-            <w:r>
-              <w:rPr>
-                <w:rFonts w:eastAsia="Arial" w:cstheme="minorHAnsi"/>
-                <w:b/>
-                <w:color w:val="010101"/>
-                <w:sz w:val="20"/>
-                <w:szCs w:val="20"/>
-              </w:rPr>
-              <w:t xml:space="preserve"> </w:t>
+              <w:t xml:space="preserve">either </w:t>
             </w:r>
             <w:r>
               <w:rPr>
@@ -5842,29 +5880,7 @@
                 <w:sz w:val="20"/>
                 <w:szCs w:val="20"/>
               </w:rPr>
-              <w:t xml:space="preserve">X program, applicant bears the ultimate responsibility for ensuring that a copy of the foreign application is received by the Office from the participating foreign intellectual property office, or a certified copy of the foreign priority application is filed, within the </w:t>
-            </w:r>
-            <w:proofErr w:type="gramStart"/>
-            <w:r>
-              <w:rPr>
-                <w:rFonts w:eastAsia="Arial" w:cstheme="minorHAnsi"/>
-                <w:b/>
-                <w:color w:val="010101"/>
-                <w:sz w:val="20"/>
-                <w:szCs w:val="20"/>
-              </w:rPr>
-              <w:t>time period</w:t>
-            </w:r>
-            <w:proofErr w:type="gramEnd"/>
-            <w:r>
-              <w:rPr>
-                <w:rFonts w:eastAsia="Arial" w:cstheme="minorHAnsi"/>
-                <w:b/>
-                <w:color w:val="010101"/>
-                <w:sz w:val="20"/>
-                <w:szCs w:val="20"/>
-              </w:rPr>
-              <w:t xml:space="preserve"> specified in 37 CFR 1.55(g)(1).</w:t>
+              <w:t>X program, applicant bears the ultimate responsibility for ensuring that a copy of the foreign application is received by the Office from the participating foreign intellectual property office, or a certified copy of the foreign priority application is filed, within the time period specified in 37 CFR 1.55(g)(1).</w:t>
             </w:r>
           </w:p>
         </w:tc>
@@ -6395,27 +6411,7 @@
                 <w:sz w:val="24"/>
                 <w:szCs w:val="24"/>
               </w:rPr>
-              <w:t xml:space="preserve"> 16, </w:t>
-            </w:r>
-            <w:proofErr w:type="gramStart"/>
-            <w:r>
-              <w:rPr>
-                <w:rFonts w:cstheme="minorHAnsi"/>
-                <w:bCs/>
-                <w:sz w:val="24"/>
-                <w:szCs w:val="24"/>
-              </w:rPr>
-              <w:t>2013</w:t>
-            </w:r>
-            <w:proofErr w:type="gramEnd"/>
-            <w:r>
-              <w:rPr>
-                <w:rFonts w:cstheme="minorHAnsi"/>
-                <w:bCs/>
-                <w:sz w:val="24"/>
-                <w:szCs w:val="24"/>
-              </w:rPr>
-              <w:t xml:space="preserve"> and (2) also contains, or contained at any time, a claim to a claimed invention that has an </w:t>
+              <w:t xml:space="preserve"> 16, 2013 and (2) also contains, or contained at any time, a claim to a claimed invention that has an </w:t>
             </w:r>
             <w:r>
               <w:rPr>
@@ -6889,19 +6885,8 @@
                 <w:sz w:val="20"/>
                 <w:szCs w:val="20"/>
               </w:rPr>
-              <w:t xml:space="preserve">participating with the USPTO in a bilateral or multilateral priority document exchange agreement in which </w:t>
-            </w:r>
-            <w:proofErr w:type="gramStart"/>
-            <w:r>
-              <w:rPr>
-                <w:rFonts w:cstheme="minorHAnsi"/>
-                <w:b/>
-                <w:sz w:val="20"/>
-                <w:szCs w:val="20"/>
-              </w:rPr>
-              <w:t>a foreign</w:t>
-            </w:r>
-            <w:proofErr w:type="gramEnd"/>
+              <w:t>participating with the USPTO in a bilateral or multilateral priority document exchange agreement in which a foreign</w:t>
+            </w:r>
           </w:p>
           <w:p>
             <w:pPr>
@@ -6923,19 +6908,8 @@
                 <w:sz w:val="20"/>
                 <w:szCs w:val="20"/>
               </w:rPr>
-              <w:t>application claiming priority to the instant patent application is filed, access to: (1) the instant patent application-as-</w:t>
-            </w:r>
-            <w:proofErr w:type="gramStart"/>
-            <w:r>
-              <w:rPr>
-                <w:rFonts w:cstheme="minorHAnsi"/>
-                <w:b/>
-                <w:sz w:val="20"/>
-                <w:szCs w:val="20"/>
-              </w:rPr>
-              <w:t>filed</w:t>
-            </w:r>
-            <w:proofErr w:type="gramEnd"/>
+              <w:t>application claiming priority to the instant patent application is filed, access to: (1) the instant patent application-as-filed</w:t>
+            </w:r>
           </w:p>
           <w:p>
             <w:pPr>
@@ -7101,19 +7075,8 @@
                 <w:sz w:val="20"/>
                 <w:szCs w:val="20"/>
               </w:rPr>
-              <w:t xml:space="preserve"> to provide the EPO access to the bibliographic data and </w:t>
-            </w:r>
-            <w:proofErr w:type="gramStart"/>
-            <w:r>
-              <w:rPr>
-                <w:rFonts w:cstheme="minorHAnsi"/>
-                <w:b/>
-                <w:sz w:val="20"/>
-                <w:szCs w:val="20"/>
-              </w:rPr>
-              <w:t>search</w:t>
-            </w:r>
-            <w:proofErr w:type="gramEnd"/>
+              <w:t xml:space="preserve"> to provide the EPO access to the bibliographic data and search</w:t>
+            </w:r>
           </w:p>
           <w:p>
             <w:pPr>
@@ -7135,19 +7098,8 @@
                 <w:sz w:val="20"/>
                 <w:szCs w:val="20"/>
               </w:rPr>
-              <w:t xml:space="preserve">results from the instant patent application when a European patent application claiming priority to the instant </w:t>
-            </w:r>
-            <w:proofErr w:type="gramStart"/>
-            <w:r>
-              <w:rPr>
-                <w:rFonts w:cstheme="minorHAnsi"/>
-                <w:b/>
-                <w:sz w:val="20"/>
-                <w:szCs w:val="20"/>
-              </w:rPr>
-              <w:t>patent</w:t>
-            </w:r>
-            <w:proofErr w:type="gramEnd"/>
+              <w:t>results from the instant patent application when a European patent application claiming priority to the instant patent</w:t>
+            </w:r>
           </w:p>
           <w:p>
             <w:pPr>
@@ -7353,19 +7305,8 @@
                 <w:sz w:val="20"/>
                 <w:szCs w:val="20"/>
               </w:rPr>
-              <w:t xml:space="preserve"> authorize the USPTO to permit a participating foreign IP office access to the </w:t>
-            </w:r>
-            <w:proofErr w:type="gramStart"/>
-            <w:r>
-              <w:rPr>
-                <w:rFonts w:cstheme="minorHAnsi"/>
-                <w:b/>
-                <w:sz w:val="20"/>
-                <w:szCs w:val="20"/>
-              </w:rPr>
-              <w:t>instant</w:t>
-            </w:r>
-            <w:proofErr w:type="gramEnd"/>
+              <w:t xml:space="preserve"> authorize the USPTO to permit a participating foreign IP office access to the instant</w:t>
+            </w:r>
           </w:p>
           <w:p>
             <w:pPr>
@@ -7554,19 +7495,8 @@
                 <w:sz w:val="20"/>
                 <w:szCs w:val="20"/>
               </w:rPr>
-              <w:t xml:space="preserve"> authorize the USPTO to transmit to the EPO any search results from the instant </w:t>
-            </w:r>
-            <w:proofErr w:type="gramStart"/>
-            <w:r>
-              <w:rPr>
-                <w:rFonts w:cstheme="minorHAnsi"/>
-                <w:b/>
-                <w:sz w:val="20"/>
-                <w:szCs w:val="20"/>
-              </w:rPr>
-              <w:t>patent</w:t>
-            </w:r>
-            <w:proofErr w:type="gramEnd"/>
+              <w:t xml:space="preserve"> authorize the USPTO to transmit to the EPO any search results from the instant patent</w:t>
+            </w:r>
           </w:p>
           <w:p>
             <w:pPr>
@@ -7597,19 +7527,8 @@
                 <w:sz w:val="20"/>
                 <w:szCs w:val="20"/>
               </w:rPr>
-              <w:t xml:space="preserve">application. If this box is checked, the USPTO will not be providing the EPO with search results from the </w:t>
-            </w:r>
-            <w:proofErr w:type="gramStart"/>
-            <w:r>
-              <w:rPr>
-                <w:rFonts w:cstheme="minorHAnsi"/>
-                <w:b/>
-                <w:sz w:val="20"/>
-                <w:szCs w:val="20"/>
-              </w:rPr>
-              <w:t>instant</w:t>
-            </w:r>
-            <w:proofErr w:type="gramEnd"/>
+              <w:t>application. If this box is checked, the USPTO will not be providing the EPO with search results from the instant</w:t>
+            </w:r>
           </w:p>
           <w:p>
             <w:pPr>
@@ -7936,16 +7855,7 @@
         <w:sz w:val="13"/>
         <w:szCs w:val="13"/>
       </w:rPr>
-      <w:t>PTO/AIA/</w:t>
-    </w:r>
-    <w:proofErr w:type="gramStart"/>
-    <w:r>
-      <w:rPr>
-        <w:rFonts w:ascii="Arial" w:eastAsia="Arial" w:hAnsi="Arial" w:cs="Arial"/>
-        <w:sz w:val="13"/>
-        <w:szCs w:val="13"/>
-      </w:rPr>
-      <w:t xml:space="preserve">14 </w:t>
+      <w:t xml:space="preserve">PTO/AIA/14 </w:t>
     </w:r>
     <w:r>
       <w:rPr>
@@ -7965,7 +7875,6 @@
       </w:rPr>
       <w:t>(</w:t>
     </w:r>
-    <w:proofErr w:type="gramEnd"/>
     <w:r>
       <w:rPr>
         <w:rFonts w:ascii="Arial" w:eastAsia="Arial" w:hAnsi="Arial" w:cs="Arial"/>
@@ -8402,7 +8311,6 @@
       </w:rPr>
       <w:t xml:space="preserve"> </w:t>
     </w:r>
-    <w:proofErr w:type="gramStart"/>
     <w:r>
       <w:rPr>
         <w:rFonts w:ascii="Arial" w:eastAsia="Arial" w:hAnsi="Arial" w:cs="Arial"/>
@@ -8428,7 +8336,6 @@
       </w:rPr>
       <w:t>are</w:t>
     </w:r>
-    <w:proofErr w:type="gramEnd"/>
     <w:r>
       <w:rPr>
         <w:rFonts w:ascii="Arial" w:eastAsia="Arial" w:hAnsi="Arial" w:cs="Arial"/>

</xml_diff>